<commit_message>
Fix reviewed Pine risk controls and indicator edge cases
</commit_message>
<xml_diff>
--- a/Liquidity_Structure_Monitor_User_Guide.docx
+++ b/Liquidity_Structure_Monitor_User_Guide.docx
@@ -15,12 +15,12 @@
         <w:pStyle w:val="Subtitle"/>
       </w:pPr>
       <w:r>
-        <w:t>LSM v1.0  |  TradingView Pine Script v6  |  October 23, 2026</w:t>
+        <w:t>LSM v1.1  |  TradingView Pine Script v6  |  October 23, 2026</w:t>
       </w:r>
     </w:p>
     <w:p>
       <w:r>
-        <w:t>Use this guide to install the indicator, recognize a liquidity sweep followed by a break of structure, interpret waiting messages, and create closing-bar alerts. It covers liquidity_structure_v1.pine, displayed on the chart as Liquidity + Structure Monitor v1.0.</w:t>
+        <w:t>Use this guide to install the indicator, recognize a liquidity sweep followed by a break of structure, interpret waiting messages, and create closing-bar alerts. It covers liquidity_structure_v1.pine, displayed on the chart as Liquidity + Structure Monitor v1.1.</w:t>
       </w:r>
     </w:p>
     <w:p>
@@ -65,7 +65,7 @@
         <w:pStyle w:val="ListNumber"/>
       </w:pPr>
       <w:r>
-        <w:t>Temporarily hide other indicator and strategy versions so you can identify which script produced each marker. Confirm that LSM v1.0 appears in the chart legend.</w:t>
+        <w:t>Temporarily hide other indicator and strategy versions so you can identify which script produced each marker. Confirm that LSM v1.1 appears in the chart legend.</w:t>
       </w:r>
     </w:p>
     <w:p>
@@ -784,7 +784,7 @@
               <w:rPr>
                 <w:sz w:val="19"/>
               </w:rPr>
-              <w:t>The frozen level a later candle must close beyond.</w:t>
+              <w:t>The frozen level a later candle must close beyond. Each setup has a separate segment; the latest 100 are retained.</w:t>
             </w:r>
           </w:p>
         </w:tc>
@@ -1065,7 +1065,7 @@
     </w:p>
     <w:p>
       <w:r>
-        <w:t>A pending setup cancels if price moves strictly beyond its original sweep extreme, exceeds its allowed age, leaves the signal session, or crosses a local calendar date. An equal touch of the extreme does not cancel. If a candle both invalidates the setup and breaks structure, invalidation takes priority.</w:t>
+        <w:t>A pending setup cancels if price moves strictly beyond its original sweep extreme, exceeds its allowed age, leaves the signal session, or crosses a local calendar date. An equal touch of the extreme does not cancel. A new date clears the prior arm while allowing a fresh opening-bar sweep. If a candle both invalidates the setup and breaks structure, invalidation takes priority.</w:t>
       </w:r>
     </w:p>
     <w:p>
@@ -1088,7 +1088,7 @@
     </w:p>
     <w:p>
       <w:r>
-        <w:t>The first row shows the current state and the chart timeframe. Read it before interpreting a dot as a signal. Only the first relevant blocker is displayed; another blocker may appear after you address the first.</w:t>
+        <w:t>The first row shows the state and chart timeframe. During a forming candle, SESSION RESET, SWEEP EXTREME BROKEN, or SETUP EXPIRED warns that the pending arm cannot confirm. Cancellation is committed at close. Otherwise, the first relevant blocker below is displayed.</w:t>
       </w:r>
     </w:p>
     <w:tbl>
@@ -4348,7 +4348,7 @@
     </w:p>
     <w:p>
       <w:r>
-        <w:t>The stop sits beyond the original sweep extreme, using a 2 tick buffer by default. The distance from the signal close to this stop must be between 0.5 and 3 ATR. The target uses 2R by default, where R is that reference price distance. Stop and target are rounded to the symbol tick size.</w:t>
+        <w:t>The stop sits beyond the original sweep extreme, using a 2 tick buffer by default. The distance from the signal close to this stop must be between 0.5 and 3 ATR. The target uses 2R by default, where R is that reference price distance. Target distance rounds outward to whole ticks, with at least one favorable tick even at small R settings.</w:t>
       </w:r>
     </w:p>
     <w:p>
@@ -4405,7 +4405,7 @@
         <w:pStyle w:val="ListNumber"/>
       </w:pPr>
       <w:r>
-        <w:t>Open TradingView Create alert. In Condition, choose Liquidity + Structure Monitor v1.0.</w:t>
+        <w:t>Open TradingView Create alert. In Condition, choose Liquidity + Structure Monitor v1.1.</w:t>
       </w:r>
     </w:p>
     <w:p>
@@ -4442,7 +4442,7 @@
     </w:p>
     <w:p>
       <w:r>
-        <w:t>The default message identifies LSM v1.0, the signal direction, exchange and ticker, chart interval, signal close, reference stop, and reference target. The signal close is a chart price and is not a broker fill. Sweep dots alone do not trigger either alert condition.</w:t>
+        <w:t>The default message identifies LSM v1.1, the signal direction, exchange and ticker, chart interval, signal close, reference stop, and reference target. The signal close is a chart price and is not a broker fill. Sweep dots alone do not trigger either alert condition.</w:t>
       </w:r>
     </w:p>
     <w:p>
@@ -5301,7 +5301,7 @@
       <w:rPr>
         <w:sz w:val="18"/>
       </w:rPr>
-      <w:t xml:space="preserve">LSM v1.0  |  </w:t>
+      <w:t xml:space="preserve">LSM v1.1  |  </w:t>
     </w:r>
     <w:fldSimple w:instr="PAGE"/>
   </w:p>

</xml_diff>